<commit_message>
docs(review): the tutor agreed to the four design decisions
Reported by the author on 2026-10-12. The record for the tutor now states the
four decisions as agreed, not as put to the tutor; the Word copy is rebuilt.
ADR-0023 and ACTIVE_CONTEXT.md record the agreement and the merge of pull
request #57. No text of the thesis changes.

Co-Authored-By: Claude Opus 5.5 <noreply@anthropic.com>
</commit_message>
<xml_diff>
--- a/docs/review/tesis_cambios_para_tutor_2026-10-12.docx
+++ b/docs/review/tesis_cambios_para_tutor_2026-10-12.docx
@@ -72,7 +72,7 @@
         <w:t xml:space="preserve"> </w:t>
       </w:r>
       <w:r>
-        <w:t xml:space="preserve">no cambia, y las decisiones que se someten a su criterio.</w:t>
+        <w:t xml:space="preserve">no cambia, y las decisiones de diseño acordadas con usted.</w:t>
       </w:r>
     </w:p>
     <w:p>
@@ -1308,13 +1308,27 @@
       </w:r>
     </w:p>
     <w:bookmarkEnd w:id="14"/>
-    <w:bookmarkStart w:id="15" w:name="decisiones-que-se-someten-a-su-criterio"/>
+    <w:bookmarkStart w:id="15" w:name="decisiones-de-diseño-acordadas"/>
     <w:p>
       <w:pPr>
         <w:pStyle w:val="Heading1"/>
       </w:pPr>
       <w:r>
-        <w:t xml:space="preserve">Decisiones que se someten a su criterio</w:t>
+        <w:t xml:space="preserve">Decisiones de diseño acordadas</w:t>
+      </w:r>
+    </w:p>
+    <w:p>
+      <w:pPr>
+        <w:pStyle w:val="FirstParagraph"/>
+      </w:pPr>
+      <w:r>
+        <w:t xml:space="preserve">Las cuatro decisiones siguientes se acordaron con usted el 12 de octubre de</w:t>
+      </w:r>
+      <w:r>
+        <w:t xml:space="preserve"> </w:t>
+      </w:r>
+      <w:r>
+        <w:t xml:space="preserve">2026 y son las que aplica el texto.</w:t>
       </w:r>
     </w:p>
     <w:p>
@@ -1336,7 +1350,7 @@
         <w:t xml:space="preserve"> </w:t>
       </w:r>
       <w:r>
-        <w:t xml:space="preserve">La alternativa es</w:t>
+        <w:t xml:space="preserve">La alternativa era</w:t>
       </w:r>
       <w:r>
         <w:t xml:space="preserve"> </w:t>
@@ -1370,7 +1384,7 @@
         <w:t xml:space="preserve"> </w:t>
       </w:r>
       <w:r>
-        <w:t xml:space="preserve">La alternativa es un objetivo</w:t>
+        <w:t xml:space="preserve">La alternativa era un objetivo</w:t>
       </w:r>
       <w:r>
         <w:t xml:space="preserve"> </w:t>
@@ -1382,13 +1396,7 @@
         <w:t xml:space="preserve"> </w:t>
       </w:r>
       <w:r>
-        <w:t xml:space="preserve">formula antes de su resultado, pero es una decisión que le corresponde</w:t>
-      </w:r>
-      <w:r>
-        <w:t xml:space="preserve"> </w:t>
-      </w:r>
-      <w:r>
-        <w:t xml:space="preserve">valorar.</w:t>
+        <w:t xml:space="preserve">formula antes de su resultado.</w:t>
       </w:r>
     </w:p>
     <w:p>
@@ -1445,12 +1453,6 @@
       </w:r>
       <w:r>
         <w:t xml:space="preserve">El capítulo nuevo resume cada estudio en una o dos páginas.</w:t>
-      </w:r>
-      <w:r>
-        <w:t xml:space="preserve"> </w:t>
-      </w:r>
-      <w:r>
-        <w:t xml:space="preserve">Puede ampliarse si lo considera necesario.</w:t>
       </w:r>
     </w:p>
     <w:bookmarkEnd w:id="15"/>

</xml_diff>

<commit_message>
fix(figures): thesis generators compute what they print; paper palette
generate_thesis_supplementary_figures.py: the mean ranks, the critical
difference and the non-significant groups of the CD diagram were typed in the
script, and the typed groups missed LIME-Anchors in fidelity. They are now
computed from exp2_block_method_summary.csv. Close labels no longer overlap;
the legend of the paired differences uses explicit handles; notes sit below
the axis labels.

generate_spanish_thesis_figures.py: the coverage figure counts the run-level
table (inventory plus recovery overlay), not the inventory alone.

Both: the method palette of the submitted papers (Paper F). The book-chapter
figures take it at their next rebuild; none was written here.

Record for the tutor and ACTIVE_CONTEXT.md updated with the figure review.

Co-Authored-By: Claude Opus 5.5 <noreply@anthropic.com>
</commit_message>
<xml_diff>
--- a/docs/review/tesis_cambios_para_tutor_2026-10-12.docx
+++ b/docs/review/tesis_cambios_para_tutor_2026-10-12.docx
@@ -1224,19 +1224,179 @@
           <w:b/>
           <w:bCs/>
         </w:rPr>
-        <w:t xml:space="preserve">Apéndice B:</w:t>
-      </w:r>
-      <w:r>
-        <w:t xml:space="preserve"> </w:t>
-      </w:r>
-      <w:r>
-        <w:t xml:space="preserve">una referencia a la «Tabla 3.1» estaba escrita a mano; ahora</w:t>
-      </w:r>
-      <w:r>
-        <w:t xml:space="preserve"> </w:t>
-      </w:r>
-      <w:r>
-        <w:t xml:space="preserve">es una referencia cruzada generada.</w:t>
+        <w:t xml:space="preserve">Revisión de las siete figuras del Capítulo 4.</w:t>
+      </w:r>
+      <w:r>
+        <w:t xml:space="preserve"> </w:t>
+      </w:r>
+      <w:r>
+        <w:t xml:space="preserve">Todas se han vuelto a</w:t>
+      </w:r>
+      <w:r>
+        <w:t xml:space="preserve"> </w:t>
+      </w:r>
+      <w:r>
+        <w:t xml:space="preserve">generar a partir de los datos actuales y coinciden en sus valores con las</w:t>
+      </w:r>
+      <w:r>
+        <w:t xml:space="preserve"> </w:t>
+      </w:r>
+      <w:r>
+        <w:t xml:space="preserve">anteriores. La revisión de cada figura frente a su pie y a las tablas encontró</w:t>
+      </w:r>
+      <w:r>
+        <w:t xml:space="preserve"> </w:t>
+      </w:r>
+      <w:r>
+        <w:t xml:space="preserve">cuatro discrepancias, ya corregidas; ninguna altera un resultado:</w:t>
+      </w:r>
+    </w:p>
+    <w:p>
+      <w:pPr>
+        <w:pStyle w:val="Compact"/>
+        <w:numPr>
+          <w:ilvl w:val="1"/>
+          <w:numId w:val="1005"/>
+        </w:numPr>
+      </w:pPr>
+      <w:r>
+        <w:rPr>
+          <w:i/>
+          <w:iCs/>
+        </w:rPr>
+        <w:t xml:space="preserve">Diagrama de diferencia crítica.</w:t>
+      </w:r>
+      <w:r>
+        <w:t xml:space="preserve"> </w:t>
+      </w:r>
+      <w:r>
+        <w:t xml:space="preserve">La figura y su pie omitían que LIME y</w:t>
+      </w:r>
+      <w:r>
+        <w:t xml:space="preserve"> </w:t>
+      </w:r>
+      <w:r>
+        <w:t xml:space="preserve">Anchors tampoco se distinguen en fidelidad (diferencia de rangos de 1.200</w:t>
+      </w:r>
+      <w:r>
+        <w:t xml:space="preserve"> </w:t>
+      </w:r>
+      <w:r>
+        <w:t xml:space="preserve">frente a una diferencia crítica de 1.211), como ya indicaba la tabla de</w:t>
+      </w:r>
+      <w:r>
+        <w:t xml:space="preserve"> </w:t>
+      </w:r>
+      <w:r>
+        <w:t xml:space="preserve">Nemenyi del mismo capítulo. La figura muestra ahora los tres grupos</w:t>
+      </w:r>
+      <w:r>
+        <w:t xml:space="preserve"> </w:t>
+      </w:r>
+      <w:r>
+        <w:t xml:space="preserve">encadenados y el pie lo describe. Los rangos y los grupos se calculan</w:t>
+      </w:r>
+      <w:r>
+        <w:t xml:space="preserve"> </w:t>
+      </w:r>
+      <w:r>
+        <w:t xml:space="preserve">desde los datos, no se escriben a mano.</w:t>
+      </w:r>
+    </w:p>
+    <w:p>
+      <w:pPr>
+        <w:pStyle w:val="Compact"/>
+        <w:numPr>
+          <w:ilvl w:val="1"/>
+          <w:numId w:val="1005"/>
+        </w:numPr>
+      </w:pPr>
+      <w:r>
+        <w:rPr>
+          <w:i/>
+          <w:iCs/>
+        </w:rPr>
+        <w:t xml:space="preserve">Perfil multidimensional.</w:t>
+      </w:r>
+      <w:r>
+        <w:t xml:space="preserve"> </w:t>
+      </w:r>
+      <w:r>
+        <w:t xml:space="preserve">El pie atribuía a LIME el liderazgo en</w:t>
+      </w:r>
+      <w:r>
+        <w:t xml:space="preserve"> </w:t>
+      </w:r>
+      <w:r>
+        <w:t xml:space="preserve">parsimonia; la figura y las tablas muestran que corresponde a DiCE.</w:t>
+      </w:r>
+    </w:p>
+    <w:p>
+      <w:pPr>
+        <w:pStyle w:val="Compact"/>
+        <w:numPr>
+          <w:ilvl w:val="1"/>
+          <w:numId w:val="1005"/>
+        </w:numPr>
+      </w:pPr>
+      <w:r>
+        <w:rPr>
+          <w:i/>
+          <w:iCs/>
+        </w:rPr>
+        <w:t xml:space="preserve">Distribución por método.</w:t>
+      </w:r>
+      <w:r>
+        <w:t xml:space="preserve"> </w:t>
+      </w:r>
+      <w:r>
+        <w:t xml:space="preserve">El pie llamaba «mediana» al valor 0.014 de la</w:t>
+      </w:r>
+      <w:r>
+        <w:t xml:space="preserve"> </w:t>
+      </w:r>
+      <w:r>
+        <w:t xml:space="preserve">estabilidad de LIME, que es la media.</w:t>
+      </w:r>
+    </w:p>
+    <w:p>
+      <w:pPr>
+        <w:pStyle w:val="Compact"/>
+        <w:numPr>
+          <w:ilvl w:val="1"/>
+          <w:numId w:val="1005"/>
+        </w:numPr>
+      </w:pPr>
+      <w:r>
+        <w:rPr>
+          <w:i/>
+          <w:iCs/>
+        </w:rPr>
+        <w:t xml:space="preserve">Cobertura analítica.</w:t>
+      </w:r>
+      <w:r>
+        <w:t xml:space="preserve"> </w:t>
+      </w:r>
+      <w:r>
+        <w:t xml:space="preserve">La figura contaba el inventario sin la</w:t>
+      </w:r>
+      <w:r>
+        <w:t xml:space="preserve"> </w:t>
+      </w:r>
+      <w:r>
+        <w:t xml:space="preserve">superposición de recuperación y mostraba SHAP sobre SVM como 14 de 15; la</w:t>
+      </w:r>
+      <w:r>
+        <w:t xml:space="preserve"> </w:t>
+      </w:r>
+      <w:r>
+        <w:t xml:space="preserve">tabla de cobertura reporta 75 de 75. La figura cuenta ahora las 275</w:t>
+      </w:r>
+      <w:r>
+        <w:t xml:space="preserve"> </w:t>
+      </w:r>
+      <w:r>
+        <w:t xml:space="preserve">ejecuciones analizadas.</w:t>
       </w:r>
     </w:p>
     <w:p>
@@ -1252,25 +1412,31 @@
           <w:b/>
           <w:bCs/>
         </w:rPr>
-        <w:t xml:space="preserve">Apéndice C:</w:t>
-      </w:r>
-      <w:r>
-        <w:t xml:space="preserve"> </w:t>
-      </w:r>
-      <w:r>
-        <w:t xml:space="preserve">la tabla de sensibilidad de KernelSHAP al conjunto de</w:t>
-      </w:r>
-      <w:r>
-        <w:t xml:space="preserve"> </w:t>
-      </w:r>
-      <w:r>
-        <w:t xml:space="preserve">referencia declara ahora que sus archivos de salida no se conservan y que se</w:t>
-      </w:r>
-      <w:r>
-        <w:t xml:space="preserve"> </w:t>
-      </w:r>
-      <w:r>
-        <w:t xml:space="preserve">reporta como medición exploratoria.</w:t>
+        <w:t xml:space="preserve">Colores de los métodos.</w:t>
+      </w:r>
+      <w:r>
+        <w:t xml:space="preserve"> </w:t>
+      </w:r>
+      <w:r>
+        <w:t xml:space="preserve">Las figuras de la tesis adoptan la misma</w:t>
+      </w:r>
+      <w:r>
+        <w:t xml:space="preserve"> </w:t>
+      </w:r>
+      <w:r>
+        <w:t xml:space="preserve">convención que las de los artículos enviados (SHAP en rojo, LIME en azul,</w:t>
+      </w:r>
+      <w:r>
+        <w:t xml:space="preserve"> </w:t>
+      </w:r>
+      <w:r>
+        <w:t xml:space="preserve">Anchors en verde, DiCE en morado), que antes estaba invertida para SHAP y</w:t>
+      </w:r>
+      <w:r>
+        <w:t xml:space="preserve"> </w:t>
+      </w:r>
+      <w:r>
+        <w:t xml:space="preserve">LIME.</w:t>
       </w:r>
     </w:p>
     <w:p>
@@ -1286,49 +1452,19 @@
           <w:b/>
           <w:bCs/>
         </w:rPr>
-        <w:t xml:space="preserve">Barrido de cifras.</w:t>
-      </w:r>
-      <w:r>
-        <w:t xml:space="preserve"> </w:t>
-      </w:r>
-      <w:r>
-        <w:t xml:space="preserve">La verificación automática cubre ahora todos los</w:t>
-      </w:r>
-      <w:r>
-        <w:t xml:space="preserve"> </w:t>
-      </w:r>
-      <w:r>
-        <w:t xml:space="preserve">archivos de la tesis. La introducción y los Capítulos 1 y 2 no tenían ninguna</w:t>
-      </w:r>
-      <w:r>
-        <w:t xml:space="preserve"> </w:t>
-      </w:r>
-      <w:r>
-        <w:t xml:space="preserve">cifra sin registrar; los apéndices tenían diez, todas resueltas.</w:t>
-      </w:r>
-    </w:p>
-    <w:bookmarkEnd w:id="14"/>
-    <w:bookmarkStart w:id="15" w:name="decisiones-de-diseño-acordadas"/>
-    <w:p>
-      <w:pPr>
-        <w:pStyle w:val="Heading1"/>
-      </w:pPr>
-      <w:r>
-        <w:t xml:space="preserve">Decisiones de diseño acordadas</w:t>
-      </w:r>
-    </w:p>
-    <w:p>
-      <w:pPr>
-        <w:pStyle w:val="FirstParagraph"/>
-      </w:pPr>
-      <w:r>
-        <w:t xml:space="preserve">Las cuatro decisiones siguientes se acordaron con usted el 12 de octubre de</w:t>
-      </w:r>
-      <w:r>
-        <w:t xml:space="preserve"> </w:t>
-      </w:r>
-      <w:r>
-        <w:t xml:space="preserve">2026 y son las que aplica el texto.</w:t>
+        <w:t xml:space="preserve">Ecuaciones.</w:t>
+      </w:r>
+      <w:r>
+        <w:t xml:space="preserve"> </w:t>
+      </w:r>
+      <w:r>
+        <w:t xml:space="preserve">Las 20 ecuaciones destacadas de los Capítulos 3 y 4 están</w:t>
+      </w:r>
+      <w:r>
+        <w:t xml:space="preserve"> </w:t>
+      </w:r>
+      <w:r>
+        <w:t xml:space="preserve">ahora numeradas y cada una se cita en el texto.</w:t>
       </w:r>
     </w:p>
     <w:p>
@@ -1336,7 +1472,127 @@
         <w:pStyle w:val="Compact"/>
         <w:numPr>
           <w:ilvl w:val="0"/>
-          <w:numId w:val="1005"/>
+          <w:numId w:val="1004"/>
+        </w:numPr>
+      </w:pPr>
+      <w:r>
+        <w:rPr>
+          <w:b/>
+          <w:bCs/>
+        </w:rPr>
+        <w:t xml:space="preserve">Apéndice B:</w:t>
+      </w:r>
+      <w:r>
+        <w:t xml:space="preserve"> </w:t>
+      </w:r>
+      <w:r>
+        <w:t xml:space="preserve">una referencia a la «Tabla 3.1» estaba escrita a mano; ahora</w:t>
+      </w:r>
+      <w:r>
+        <w:t xml:space="preserve"> </w:t>
+      </w:r>
+      <w:r>
+        <w:t xml:space="preserve">es una referencia cruzada generada.</w:t>
+      </w:r>
+    </w:p>
+    <w:p>
+      <w:pPr>
+        <w:pStyle w:val="Compact"/>
+        <w:numPr>
+          <w:ilvl w:val="0"/>
+          <w:numId w:val="1004"/>
+        </w:numPr>
+      </w:pPr>
+      <w:r>
+        <w:rPr>
+          <w:b/>
+          <w:bCs/>
+        </w:rPr>
+        <w:t xml:space="preserve">Apéndice C:</w:t>
+      </w:r>
+      <w:r>
+        <w:t xml:space="preserve"> </w:t>
+      </w:r>
+      <w:r>
+        <w:t xml:space="preserve">la tabla de sensibilidad de KernelSHAP al conjunto de</w:t>
+      </w:r>
+      <w:r>
+        <w:t xml:space="preserve"> </w:t>
+      </w:r>
+      <w:r>
+        <w:t xml:space="preserve">referencia declara ahora que sus archivos de salida no se conservan y que se</w:t>
+      </w:r>
+      <w:r>
+        <w:t xml:space="preserve"> </w:t>
+      </w:r>
+      <w:r>
+        <w:t xml:space="preserve">reporta como medición exploratoria.</w:t>
+      </w:r>
+    </w:p>
+    <w:p>
+      <w:pPr>
+        <w:pStyle w:val="Compact"/>
+        <w:numPr>
+          <w:ilvl w:val="0"/>
+          <w:numId w:val="1004"/>
+        </w:numPr>
+      </w:pPr>
+      <w:r>
+        <w:rPr>
+          <w:b/>
+          <w:bCs/>
+        </w:rPr>
+        <w:t xml:space="preserve">Barrido de cifras.</w:t>
+      </w:r>
+      <w:r>
+        <w:t xml:space="preserve"> </w:t>
+      </w:r>
+      <w:r>
+        <w:t xml:space="preserve">La verificación automática cubre ahora todos los</w:t>
+      </w:r>
+      <w:r>
+        <w:t xml:space="preserve"> </w:t>
+      </w:r>
+      <w:r>
+        <w:t xml:space="preserve">archivos de la tesis. La introducción y los Capítulos 1 y 2 no tenían ninguna</w:t>
+      </w:r>
+      <w:r>
+        <w:t xml:space="preserve"> </w:t>
+      </w:r>
+      <w:r>
+        <w:t xml:space="preserve">cifra sin registrar; los apéndices tenían diez, todas resueltas.</w:t>
+      </w:r>
+    </w:p>
+    <w:bookmarkEnd w:id="14"/>
+    <w:bookmarkStart w:id="15" w:name="decisiones-de-diseño-acordadas"/>
+    <w:p>
+      <w:pPr>
+        <w:pStyle w:val="Heading1"/>
+      </w:pPr>
+      <w:r>
+        <w:t xml:space="preserve">Decisiones de diseño acordadas</w:t>
+      </w:r>
+    </w:p>
+    <w:p>
+      <w:pPr>
+        <w:pStyle w:val="FirstParagraph"/>
+      </w:pPr>
+      <w:r>
+        <w:t xml:space="preserve">Las cuatro decisiones siguientes se acordaron con usted el 12 de octubre de</w:t>
+      </w:r>
+      <w:r>
+        <w:t xml:space="preserve"> </w:t>
+      </w:r>
+      <w:r>
+        <w:t xml:space="preserve">2026 y son las que aplica el texto.</w:t>
+      </w:r>
+    </w:p>
+    <w:p>
+      <w:pPr>
+        <w:pStyle w:val="Compact"/>
+        <w:numPr>
+          <w:ilvl w:val="0"/>
+          <w:numId w:val="1006"/>
         </w:numPr>
       </w:pPr>
       <w:r>
@@ -1370,7 +1626,7 @@
         <w:pStyle w:val="Compact"/>
         <w:numPr>
           <w:ilvl w:val="0"/>
-          <w:numId w:val="1005"/>
+          <w:numId w:val="1006"/>
         </w:numPr>
       </w:pPr>
       <w:r>
@@ -1404,7 +1660,7 @@
         <w:pStyle w:val="Compact"/>
         <w:numPr>
           <w:ilvl w:val="0"/>
-          <w:numId w:val="1005"/>
+          <w:numId w:val="1006"/>
         </w:numPr>
       </w:pPr>
       <w:r>
@@ -1438,7 +1694,7 @@
         <w:pStyle w:val="Compact"/>
         <w:numPr>
           <w:ilvl w:val="0"/>
-          <w:numId w:val="1005"/>
+          <w:numId w:val="1006"/>
         </w:numPr>
       </w:pPr>
       <w:r>
@@ -1470,7 +1726,7 @@
         <w:pStyle w:val="Compact"/>
         <w:numPr>
           <w:ilvl w:val="0"/>
-          <w:numId w:val="1006"/>
+          <w:numId w:val="1007"/>
         </w:numPr>
       </w:pPr>
       <w:r>
@@ -1488,7 +1744,7 @@
         <w:pStyle w:val="Compact"/>
         <w:numPr>
           <w:ilvl w:val="0"/>
-          <w:numId w:val="1006"/>
+          <w:numId w:val="1007"/>
         </w:numPr>
       </w:pPr>
       <w:r>
@@ -1506,7 +1762,7 @@
         <w:pStyle w:val="Compact"/>
         <w:numPr>
           <w:ilvl w:val="0"/>
-          <w:numId w:val="1006"/>
+          <w:numId w:val="1007"/>
         </w:numPr>
       </w:pPr>
       <w:r>
@@ -1524,7 +1780,7 @@
         <w:pStyle w:val="Compact"/>
         <w:numPr>
           <w:ilvl w:val="0"/>
-          <w:numId w:val="1006"/>
+          <w:numId w:val="1007"/>
         </w:numPr>
       </w:pPr>
       <w:r>
@@ -1899,6 +2155,9 @@
     <w:abstractNumId w:val="991"/>
   </w:num>
   <w:num w:numId="1005">
+    <w:abstractNumId w:val="991"/>
+  </w:num>
+  <w:num w:numId="1006">
     <w:abstractNumId w:val="99411"/>
     <w:lvlOverride w:ilvl="0">
       <w:startOverride w:val="1"/>
@@ -1928,7 +2187,7 @@
       <w:startOverride w:val="1"/>
     </w:lvlOverride>
   </w:num>
-  <w:num w:numId="1006">
+  <w:num w:numId="1007">
     <w:abstractNumId w:val="991"/>
   </w:num>
 </w:numbering>

</xml_diff>

<commit_message>
feat(figures): generator of the Chapter 6 figures; figures checked like equations
scripts/generate_thesis_followup_figures.py draws the five figures of the
follow-up chapter from the result files of the four studies, in the method
colours of the papers, printing no value as a label.

generate_spanish_thesis_figures.py: median and interquartile range in the
stability-against-cost figure.

check_equations.py also fails on a figure without a label or never cited, and
lists with --tables the labelled tables no text cites (19 of 44, reported
only). Test added.

docs/review/thesis-figure-review_2026-10-13.md: where a figure would help the
reader, which book-chapter figures can be reused and which cannot, and seven
proposed new figures. Record for the tutor and ACTIVE_CONTEXT.md updated; the
previous handoff moved to the archive.

Co-Authored-By: Claude Opus 5.5 <noreply@anthropic.com>
</commit_message>
<xml_diff>
--- a/docs/review/tesis_cambios_para_tutor_2026-10-12.docx
+++ b/docs/review/tesis_cambios_para_tutor_2026-10-12.docx
@@ -1397,6 +1397,123 @@
       </w:r>
       <w:r>
         <w:t xml:space="preserve">ejecuciones analizadas.</w:t>
+      </w:r>
+    </w:p>
+    <w:p>
+      <w:pPr>
+        <w:pStyle w:val="Compact"/>
+        <w:numPr>
+          <w:ilvl w:val="0"/>
+          <w:numId w:val="1004"/>
+        </w:numPr>
+      </w:pPr>
+      <w:r>
+        <w:rPr>
+          <w:b/>
+          <w:bCs/>
+        </w:rPr>
+        <w:t xml:space="preserve">Figura de estabilidad y coste.</w:t>
+      </w:r>
+      <w:r>
+        <w:t xml:space="preserve"> </w:t>
+      </w:r>
+      <w:r>
+        <w:t xml:space="preserve">Mostraba la media con una desviación</w:t>
+      </w:r>
+      <w:r>
+        <w:t xml:space="preserve"> </w:t>
+      </w:r>
+      <w:r>
+        <w:t xml:space="preserve">estándar a cada lado; como el coste varía en órdenes de magnitud entre</w:t>
+      </w:r>
+      <w:r>
+        <w:t xml:space="preserve"> </w:t>
+      </w:r>
+      <w:r>
+        <w:t xml:space="preserve">familias de modelos, la desviación superaba a la media y la barra se salía del</w:t>
+      </w:r>
+      <w:r>
+        <w:t xml:space="preserve"> </w:t>
+      </w:r>
+      <w:r>
+        <w:t xml:space="preserve">eje logarítmico. Muestra ahora la mediana de los 15 bloques y el rango</w:t>
+      </w:r>
+      <w:r>
+        <w:t xml:space="preserve"> </w:t>
+      </w:r>
+      <w:r>
+        <w:t xml:space="preserve">intercuartílico, y el pie lo indica.</w:t>
+      </w:r>
+    </w:p>
+    <w:p>
+      <w:pPr>
+        <w:pStyle w:val="Compact"/>
+        <w:numPr>
+          <w:ilvl w:val="0"/>
+          <w:numId w:val="1004"/>
+        </w:numPr>
+      </w:pPr>
+      <w:r>
+        <w:rPr>
+          <w:b/>
+          <w:bCs/>
+        </w:rPr>
+        <w:t xml:space="preserve">Figuras citadas en el texto.</w:t>
+      </w:r>
+      <w:r>
+        <w:t xml:space="preserve"> </w:t>
+      </w:r>
+      <w:r>
+        <w:t xml:space="preserve">Cinco de las siete figuras del Capítulo 4 no</w:t>
+      </w:r>
+      <w:r>
+        <w:t xml:space="preserve"> </w:t>
+      </w:r>
+      <w:r>
+        <w:t xml:space="preserve">se citaban desde el texto; ahora se citan todas.</w:t>
+      </w:r>
+    </w:p>
+    <w:p>
+      <w:pPr>
+        <w:pStyle w:val="Compact"/>
+        <w:numPr>
+          <w:ilvl w:val="0"/>
+          <w:numId w:val="1004"/>
+        </w:numPr>
+      </w:pPr>
+      <w:r>
+        <w:rPr>
+          <w:b/>
+          <w:bCs/>
+        </w:rPr>
+        <w:t xml:space="preserve">Cinco figuras nuevas en el Capítulo 6</w:t>
+      </w:r>
+      <w:r>
+        <w:t xml:space="preserve">, una o dos por estudio de</w:t>
+      </w:r>
+      <w:r>
+        <w:t xml:space="preserve"> </w:t>
+      </w:r>
+      <w:r>
+        <w:t xml:space="preserve">seguimiento, en español y generadas desde los archivos de resultados de cada</w:t>
+      </w:r>
+      <w:r>
+        <w:t xml:space="preserve"> </w:t>
+      </w:r>
+      <w:r>
+        <w:t xml:space="preserve">estudio: diferencia de calidad entre errores y aciertos; estabilidad según el</w:t>
+      </w:r>
+      <w:r>
+        <w:t xml:space="preserve"> </w:t>
+      </w:r>
+      <w:r>
+        <w:t xml:space="preserve">margen de predicción; solapamiento entre SHAP y LIME; rango de cada método en</w:t>
+      </w:r>
+      <w:r>
+        <w:t xml:space="preserve"> </w:t>
+      </w:r>
+      <w:r>
+        <w:t xml:space="preserve">los 16 conjuntos de datos; y acuerdo entre jueces en el control positivo.</w:t>
       </w:r>
     </w:p>
     <w:p>

</xml_diff>

<commit_message>
feat(figures): generator of the remaining thesis figures; tables checked too
scripts/generate_thesis_extra_figures.py: the concept figures shared with the
book chapter (drawn by the chapter's generators, output sent to the thesis
folder only), five structure diagrams and two data figures.

scripts/generate_thesis_supplementary_figures_en.py: no longer a second copy
of the code; it runs the Spanish generator and translates the text.

scripts/generate_cifie_equation_figures.py: figure d11 no longer prints a
precision of 97.4% and a coverage of 22.5%, values no result backs.

scripts/pubs/check_equations.py: a table needs a caption with a label and a
citation, as figures and equations do. Test added. Rule written in
.ace/standards/documentation.md ("Manuscripts: Figures and Tables") and in the
core rule of .aceconfig (author's decision, 2026-10-13).

Figure review, record for the tutor and ACTIVE_CONTEXT.md updated.

Co-Authored-By: Claude Opus 5.5 <noreply@anthropic.com>
</commit_message>
<xml_diff>
--- a/docs/review/tesis_cambios_para_tutor_2026-10-12.docx
+++ b/docs/review/tesis_cambios_para_tutor_2026-10-12.docx
@@ -1529,6 +1529,300 @@
           <w:b/>
           <w:bCs/>
         </w:rPr>
+        <w:t xml:space="preserve">Diecisiete figuras nuevas en el resto de la tesis.</w:t>
+      </w:r>
+      <w:r>
+        <w:t xml:space="preserve"> </w:t>
+      </w:r>
+      <w:r>
+        <w:t xml:space="preserve">Los Capítulos 1, 2, 3,</w:t>
+      </w:r>
+      <w:r>
+        <w:t xml:space="preserve"> </w:t>
+      </w:r>
+      <w:r>
+        <w:t xml:space="preserve">5 y 7 no tenían ninguna figura. Se añaden:</w:t>
+      </w:r>
+    </w:p>
+    <w:p>
+      <w:pPr>
+        <w:pStyle w:val="Compact"/>
+        <w:numPr>
+          <w:ilvl w:val="1"/>
+          <w:numId w:val="1006"/>
+        </w:numPr>
+      </w:pPr>
+      <w:r>
+        <w:rPr>
+          <w:i/>
+          <w:iCs/>
+        </w:rPr>
+        <w:t xml:space="preserve">Capítulo 1:</w:t>
+      </w:r>
+      <w:r>
+        <w:t xml:space="preserve"> </w:t>
+      </w:r>
+      <w:r>
+        <w:t xml:space="preserve">mapa de la tesis (estudios, objetivos, hipótesis, capítulos y</w:t>
+      </w:r>
+      <w:r>
+        <w:t xml:space="preserve"> </w:t>
+      </w:r>
+      <w:r>
+        <w:t xml:space="preserve">estatuto).</w:t>
+      </w:r>
+    </w:p>
+    <w:p>
+      <w:pPr>
+        <w:pStyle w:val="Compact"/>
+        <w:numPr>
+          <w:ilvl w:val="1"/>
+          <w:numId w:val="1006"/>
+        </w:numPr>
+      </w:pPr>
+      <w:r>
+        <w:rPr>
+          <w:i/>
+          <w:iCs/>
+        </w:rPr>
+        <w:t xml:space="preserve">Capítulo 2:</w:t>
+      </w:r>
+      <w:r>
+        <w:t xml:space="preserve"> </w:t>
+      </w:r>
+      <w:r>
+        <w:t xml:space="preserve">ocho figuras conceptuales (las tres nociones de</w:t>
+      </w:r>
+      <w:r>
+        <w:t xml:space="preserve"> </w:t>
+      </w:r>
+      <w:r>
+        <w:t xml:space="preserve">transparencia, interpretabilidad y explicabilidad; del modelo interpretable</w:t>
+      </w:r>
+      <w:r>
+        <w:t xml:space="preserve"> </w:t>
+      </w:r>
+      <w:r>
+        <w:t xml:space="preserve">a la explicación post-hoc; alcance local y global; un mismo caso explicado</w:t>
+      </w:r>
+      <w:r>
+        <w:t xml:space="preserve"> </w:t>
+      </w:r>
+      <w:r>
+        <w:t xml:space="preserve">mediante cuatro objetos; niveles de evaluación; y un esquema por método</w:t>
+      </w:r>
+      <w:r>
+        <w:t xml:space="preserve"> </w:t>
+      </w:r>
+      <w:r>
+        <w:t xml:space="preserve">para LIME, SHAP, y Anchors y DiCE). Proceden del capítulo de libro del</w:t>
+      </w:r>
+      <w:r>
+        <w:t xml:space="preserve"> </w:t>
+      </w:r>
+      <w:r>
+        <w:t xml:space="preserve">autor y se marcan como ilustraciones esquemáticas.</w:t>
+      </w:r>
+    </w:p>
+    <w:p>
+      <w:pPr>
+        <w:pStyle w:val="Compact"/>
+        <w:numPr>
+          <w:ilvl w:val="1"/>
+          <w:numId w:val="1006"/>
+        </w:numPr>
+      </w:pPr>
+      <w:r>
+        <w:rPr>
+          <w:i/>
+          <w:iCs/>
+        </w:rPr>
+        <w:t xml:space="preserve">Capítulo 3:</w:t>
+      </w:r>
+      <w:r>
+        <w:t xml:space="preserve"> </w:t>
+      </w:r>
+      <w:r>
+        <w:t xml:space="preserve">cadena de evidencia; puertas de FOM-7 con la traza de una</w:t>
+      </w:r>
+      <w:r>
+        <w:t xml:space="preserve"> </w:t>
+      </w:r>
+      <w:r>
+        <w:t xml:space="preserve">afirmación (sustituye a la cadena de flechas que figuraba como ecuación); y</w:t>
+      </w:r>
+      <w:r>
+        <w:t xml:space="preserve"> </w:t>
+      </w:r>
+      <w:r>
+        <w:t xml:space="preserve">unidades de análisis (300 ejecuciones, 75 celdas pareadas, 15 bloques).</w:t>
+      </w:r>
+    </w:p>
+    <w:p>
+      <w:pPr>
+        <w:pStyle w:val="Compact"/>
+        <w:numPr>
+          <w:ilvl w:val="1"/>
+          <w:numId w:val="1006"/>
+        </w:numPr>
+      </w:pPr>
+      <w:r>
+        <w:rPr>
+          <w:i/>
+          <w:iCs/>
+        </w:rPr>
+        <w:t xml:space="preserve">Capítulo 4:</w:t>
+      </w:r>
+      <w:r>
+        <w:t xml:space="preserve"> </w:t>
+      </w:r>
+      <w:r>
+        <w:t xml:space="preserve">coste por familia de modelos para SHAP y LIME.</w:t>
+      </w:r>
+    </w:p>
+    <w:p>
+      <w:pPr>
+        <w:pStyle w:val="Compact"/>
+        <w:numPr>
+          <w:ilvl w:val="1"/>
+          <w:numId w:val="1006"/>
+        </w:numPr>
+      </w:pPr>
+      <w:r>
+        <w:rPr>
+          <w:i/>
+          <w:iCs/>
+        </w:rPr>
+        <w:t xml:space="preserve">Capítulo 5:</w:t>
+      </w:r>
+      <w:r>
+        <w:t xml:space="preserve"> </w:t>
+      </w:r>
+      <w:r>
+        <w:t xml:space="preserve">los cuatro ejes de la taxonomía con las métricas del</w:t>
+      </w:r>
+      <w:r>
+        <w:t xml:space="preserve"> </w:t>
+      </w:r>
+      <w:r>
+        <w:t xml:space="preserve">benchmark; y fiabilidad inter-juez por dimensión en las dos cohortes frente</w:t>
+      </w:r>
+      <w:r>
+        <w:t xml:space="preserve"> </w:t>
+      </w:r>
+      <w:r>
+        <w:t xml:space="preserve">al umbral.</w:t>
+      </w:r>
+    </w:p>
+    <w:p>
+      <w:pPr>
+        <w:pStyle w:val="Compact"/>
+        <w:numPr>
+          <w:ilvl w:val="1"/>
+          <w:numId w:val="1006"/>
+        </w:numPr>
+      </w:pPr>
+      <w:r>
+        <w:rPr>
+          <w:i/>
+          <w:iCs/>
+        </w:rPr>
+        <w:t xml:space="preserve">Capítulo 6:</w:t>
+      </w:r>
+      <w:r>
+        <w:t xml:space="preserve"> </w:t>
+      </w:r>
+      <w:r>
+        <w:t xml:space="preserve">secuencia de la evidencia, con lo que cubre el plan congelado</w:t>
+      </w:r>
+      <w:r>
+        <w:t xml:space="preserve"> </w:t>
+      </w:r>
+      <w:r>
+        <w:t xml:space="preserve">y lo posterior.</w:t>
+      </w:r>
+    </w:p>
+    <w:p>
+      <w:pPr>
+        <w:pStyle w:val="Compact"/>
+        <w:numPr>
+          <w:ilvl w:val="1"/>
+          <w:numId w:val="1006"/>
+        </w:numPr>
+      </w:pPr>
+      <w:r>
+        <w:rPr>
+          <w:i/>
+          <w:iCs/>
+        </w:rPr>
+        <w:t xml:space="preserve">Capítulo 7:</w:t>
+      </w:r>
+      <w:r>
+        <w:t xml:space="preserve"> </w:t>
+      </w:r>
+      <w:r>
+        <w:t xml:space="preserve">guía de selección de métodos, con la condición que verificar</w:t>
+      </w:r>
+      <w:r>
+        <w:t xml:space="preserve"> </w:t>
+      </w:r>
+      <w:r>
+        <w:t xml:space="preserve">en cada caso.</w:t>
+      </w:r>
+    </w:p>
+    <w:p>
+      <w:pPr>
+        <w:pStyle w:val="Compact"/>
+        <w:numPr>
+          <w:ilvl w:val="0"/>
+          <w:numId w:val="1004"/>
+        </w:numPr>
+      </w:pPr>
+      <w:r>
+        <w:rPr>
+          <w:b/>
+          <w:bCs/>
+        </w:rPr>
+        <w:t xml:space="preserve">Tablas citadas en el texto.</w:t>
+      </w:r>
+      <w:r>
+        <w:t xml:space="preserve"> </w:t>
+      </w:r>
+      <w:r>
+        <w:t xml:space="preserve">Dieciocho tablas no se citaban por referencia</w:t>
+      </w:r>
+      <w:r>
+        <w:t xml:space="preserve"> </w:t>
+      </w:r>
+      <w:r>
+        <w:t xml:space="preserve">y una del Capítulo 2 no tenía pie ni número; ahora las 45 tablas están</w:t>
+      </w:r>
+      <w:r>
+        <w:t xml:space="preserve"> </w:t>
+      </w:r>
+      <w:r>
+        <w:t xml:space="preserve">numeradas y citadas. La verificación automática exige ya número y cita para</w:t>
+      </w:r>
+      <w:r>
+        <w:t xml:space="preserve"> </w:t>
+      </w:r>
+      <w:r>
+        <w:t xml:space="preserve">ecuaciones, figuras y tablas.</w:t>
+      </w:r>
+    </w:p>
+    <w:p>
+      <w:pPr>
+        <w:pStyle w:val="Compact"/>
+        <w:numPr>
+          <w:ilvl w:val="0"/>
+          <w:numId w:val="1004"/>
+        </w:numPr>
+      </w:pPr>
+      <w:r>
+        <w:rPr>
+          <w:b/>
+          <w:bCs/>
+        </w:rPr>
         <w:t xml:space="preserve">Colores de los métodos.</w:t>
       </w:r>
       <w:r>
@@ -1709,7 +2003,7 @@
         <w:pStyle w:val="Compact"/>
         <w:numPr>
           <w:ilvl w:val="0"/>
-          <w:numId w:val="1006"/>
+          <w:numId w:val="1007"/>
         </w:numPr>
       </w:pPr>
       <w:r>
@@ -1743,7 +2037,7 @@
         <w:pStyle w:val="Compact"/>
         <w:numPr>
           <w:ilvl w:val="0"/>
-          <w:numId w:val="1006"/>
+          <w:numId w:val="1007"/>
         </w:numPr>
       </w:pPr>
       <w:r>
@@ -1777,7 +2071,7 @@
         <w:pStyle w:val="Compact"/>
         <w:numPr>
           <w:ilvl w:val="0"/>
-          <w:numId w:val="1006"/>
+          <w:numId w:val="1007"/>
         </w:numPr>
       </w:pPr>
       <w:r>
@@ -1811,7 +2105,7 @@
         <w:pStyle w:val="Compact"/>
         <w:numPr>
           <w:ilvl w:val="0"/>
-          <w:numId w:val="1006"/>
+          <w:numId w:val="1007"/>
         </w:numPr>
       </w:pPr>
       <w:r>
@@ -1843,7 +2137,7 @@
         <w:pStyle w:val="Compact"/>
         <w:numPr>
           <w:ilvl w:val="0"/>
-          <w:numId w:val="1007"/>
+          <w:numId w:val="1008"/>
         </w:numPr>
       </w:pPr>
       <w:r>
@@ -1861,7 +2155,7 @@
         <w:pStyle w:val="Compact"/>
         <w:numPr>
           <w:ilvl w:val="0"/>
-          <w:numId w:val="1007"/>
+          <w:numId w:val="1008"/>
         </w:numPr>
       </w:pPr>
       <w:r>
@@ -1879,7 +2173,7 @@
         <w:pStyle w:val="Compact"/>
         <w:numPr>
           <w:ilvl w:val="0"/>
-          <w:numId w:val="1007"/>
+          <w:numId w:val="1008"/>
         </w:numPr>
       </w:pPr>
       <w:r>
@@ -1897,7 +2191,7 @@
         <w:pStyle w:val="Compact"/>
         <w:numPr>
           <w:ilvl w:val="0"/>
-          <w:numId w:val="1007"/>
+          <w:numId w:val="1008"/>
         </w:numPr>
       </w:pPr>
       <w:r>
@@ -2275,6 +2569,9 @@
     <w:abstractNumId w:val="991"/>
   </w:num>
   <w:num w:numId="1006">
+    <w:abstractNumId w:val="991"/>
+  </w:num>
+  <w:num w:numId="1007">
     <w:abstractNumId w:val="99411"/>
     <w:lvlOverride w:ilvl="0">
       <w:startOverride w:val="1"/>
@@ -2304,7 +2601,7 @@
       <w:startOverride w:val="1"/>
     </w:lvlOverride>
   </w:num>
-  <w:num w:numId="1007">
+  <w:num w:numId="1008">
     <w:abstractNumId w:val="991"/>
   </w:num>
 </w:numbering>

</xml_diff>